<commit_message>
feat(security): harden Sprint 3 controls
- Tighten API, ML, and mobile security controls
- Expand CI with SAST, dependency audits, and secret scanning
- Update security docs and Sprint 3 deliverables
</commit_message>
<xml_diff>
--- a/docs/deliverables/Quadro_de_Valor.docx
+++ b/docs/deliverables/Quadro_de_Valor.docx
@@ -694,7 +694,7 @@
               <w:rPr>
                 <w:sz w:val="18"/>
               </w:rPr>
-              <w:t>Garantia de proteção de dados pessoais (LGPD) e auditabilidade.</w:t>
+              <w:t>Proteção de dados pessoais e trilha de auditoria revisadas continuamente.</w:t>
             </w:r>
           </w:p>
         </w:tc>
@@ -724,7 +724,7 @@
               <w:rPr>
                 <w:sz w:val="18"/>
               </w:rPr>
-              <w:t>Zero incidentes de vazamento; LGPD compliance contínuo.</w:t>
+              <w:t>Controles básicos implementados; requisitos legais e de produção ainda precisam de validação.</w:t>
             </w:r>
           </w:p>
         </w:tc>
@@ -739,7 +739,7 @@
               <w:rPr>
                 <w:sz w:val="18"/>
               </w:rPr>
-              <w:t>100% requisições ML com payload anonimizado; 100% ações sensíveis auditadas.</w:t>
+              <w:t>Sem nome/CPF/e-mail no payload /predict; falhas de audit_log aparecem no Pino.</w:t>
             </w:r>
           </w:p>
         </w:tc>

</xml_diff>